<commit_message>
chore: complete T01 - repo structure, stack migration to FastAPI/Python
- Add .gitignore, README.md with FastAPI stack
- Create backend/ and frontend/ folder structure
- Move docker-compose.dev.yml to backend/
- Add backend/models.py (SQLAlchemy 2.0, all 12 models)
- Update .env.example for FastAPI/Python (Celery, asyncpg, Loguru, slowapi)
- Update schema.prisma as reference only (SQLAlchemy is source of truth)
- Update all Documentação/ .docx files: Node.js/Prisma → FastAPI/Python/SQLAlchemy

Co-Authored-By: Claude Sonnet 4.6 <noreply@anthropic.com>
</commit_message>
<xml_diff>
--- a/Documentação/Arquitetura_Tecnica_HelpDesk_v1.docx
+++ b/Documentação/Arquitetura_Tecnica_HelpDesk_v1.docx
@@ -490,7 +490,7 @@
           <w:sz w:val="20"/>
           <w:szCs w:val="20"/>
         </w:rPr>
-        <w:t xml:space="preserve">A arquitetura abrange todos os componentes do sistema: Frontend (SPA React), Backend (API RESTful Node.js), banco de dados (PostgreSQL + Redis), comunicacao em tempo real (Socket.IO), integracao com IA (LLM API), armazenamento de arquivos (S3-compatible), servico de e-mail (SMTP), e infraestrutura de deploy (Docker + VPS Hostinger).</w:t>
+        <w:t xml:space="preserve">A arquitetura abrange todos os componentes do sistema: Frontend (SPA React), Backend (API RESTful Python 3.12+), banco de dados (PostgreSQL + Redis), comunicacao em tempo real (FastAPI WebSockets), integracao com IA (LLM API), armazenamento de arquivos (S3-compatible), servico de e-mail (SMTP), e infraestrutura de deploy (Docker + VPS Hostinger).</w:t>
       </w:r>
     </w:p>
     <w:p>
@@ -790,7 +790,7 @@
                 <w:sz w:val="20"/>
                 <w:szCs w:val="20"/>
               </w:rPr>
-              <w:t xml:space="preserve">API Gateway (Express.js) - Roteamento, middlewares, autenticacao JWT, validacao, rate limiting</w:t>
+              <w:t xml:space="preserve">API Gateway (FastAPI) - Roteamento, middlewares, autenticacao JWT, validacao, rate limiting</w:t>
             </w:r>
           </w:p>
         </w:tc>
@@ -1391,7 +1391,7 @@
                 <w:sz w:val="20"/>
                 <w:szCs w:val="20"/>
               </w:rPr>
-              <w:t xml:space="preserve">Tipagem estatica para reducao de bugs e melhor DX</w:t>
+              <w:t xml:space="preserve">Tipagem estatica para reducao de bugs e melhor DX (frontend)</w:t>
             </w:r>
           </w:p>
         </w:tc>
@@ -1941,7 +1941,7 @@
                 <w:sz w:val="20"/>
                 <w:szCs w:val="20"/>
               </w:rPr>
-              <w:t xml:space="preserve">Socket.IO Client</w:t>
+              <w:t xml:space="preserve">WebSocket (Native)</w:t>
             </w:r>
           </w:p>
         </w:tc>
@@ -1968,7 +1968,7 @@
                 <w:sz w:val="20"/>
                 <w:szCs w:val="20"/>
               </w:rPr>
-              <w:t xml:space="preserve">4.x</w:t>
+              <w:t xml:space="preserve">HTML5</w:t>
             </w:r>
           </w:p>
         </w:tc>
@@ -2256,7 +2256,7 @@
                 <w:sz w:val="20"/>
                 <w:szCs w:val="20"/>
               </w:rPr>
-              <w:t xml:space="preserve">Formularios performaticos com validacao Zod</w:t>
+              <w:t xml:space="preserve">Formularios performaticos com validacao Pydantic v2</w:t>
             </w:r>
           </w:p>
         </w:tc>
@@ -2287,7 +2287,7 @@
                 <w:sz w:val="20"/>
                 <w:szCs w:val="20"/>
               </w:rPr>
-              <w:t xml:space="preserve">Zod</w:t>
+              <w:t xml:space="preserve">Pydantic v2</w:t>
             </w:r>
           </w:p>
         </w:tc>
@@ -2314,7 +2314,7 @@
                 <w:sz w:val="20"/>
                 <w:szCs w:val="20"/>
               </w:rPr>
-              <w:t xml:space="preserve">3.x</w:t>
+              <w:t xml:space="preserve">2.x</w:t>
             </w:r>
           </w:p>
         </w:tc>
@@ -2507,7 +2507,7 @@
                 <w:sz w:val="20"/>
                 <w:szCs w:val="20"/>
               </w:rPr>
-              <w:t xml:space="preserve">Node.js</w:t>
+              <w:t xml:space="preserve">Python</w:t>
             </w:r>
           </w:p>
         </w:tc>
@@ -2534,7 +2534,7 @@
                 <w:sz w:val="20"/>
                 <w:szCs w:val="20"/>
               </w:rPr>
-              <w:t xml:space="preserve">20 LTS</w:t>
+              <w:t xml:space="preserve">3.12+</w:t>
             </w:r>
           </w:p>
         </w:tc>
@@ -2561,7 +2561,7 @@
                 <w:sz w:val="20"/>
                 <w:szCs w:val="20"/>
               </w:rPr>
-              <w:t xml:space="preserve">Runtime JavaScript com event loop nao-bloqueante, ideal para I/O intensivo</w:t>
+              <w:t xml:space="preserve">Runtime com tipagem estatica, ideal para I/O intensivo e processamento</w:t>
             </w:r>
           </w:p>
         </w:tc>
@@ -2593,7 +2593,7 @@
                 <w:sz w:val="20"/>
                 <w:szCs w:val="20"/>
               </w:rPr>
-              <w:t xml:space="preserve">Express.js</w:t>
+              <w:t xml:space="preserve">FastAPI</w:t>
             </w:r>
           </w:p>
         </w:tc>
@@ -2621,7 +2621,7 @@
                 <w:sz w:val="20"/>
                 <w:szCs w:val="20"/>
               </w:rPr>
-              <w:t xml:space="preserve">4.x</w:t>
+              <w:t xml:space="preserve">0.100+</w:t>
             </w:r>
           </w:p>
         </w:tc>
@@ -2649,7 +2649,7 @@
                 <w:sz w:val="20"/>
                 <w:szCs w:val="20"/>
               </w:rPr>
-              <w:t xml:space="preserve">Framework HTTP minimalista com vasto ecossistema de middlewares</w:t>
+              <w:t xml:space="preserve">Framework HTTP moderno com auto-documentacao e validacao integrada</w:t>
             </w:r>
           </w:p>
         </w:tc>
@@ -2680,7 +2680,7 @@
                 <w:sz w:val="20"/>
                 <w:szCs w:val="20"/>
               </w:rPr>
-              <w:t xml:space="preserve">TypeScript</w:t>
+              <w:t xml:space="preserve">Python</w:t>
             </w:r>
           </w:p>
         </w:tc>
@@ -2707,7 +2707,7 @@
                 <w:sz w:val="20"/>
                 <w:szCs w:val="20"/>
               </w:rPr>
-              <w:t xml:space="preserve">5.x</w:t>
+              <w:t xml:space="preserve">3.12+</w:t>
             </w:r>
           </w:p>
         </w:tc>
@@ -2734,7 +2734,7 @@
                 <w:sz w:val="20"/>
                 <w:szCs w:val="20"/>
               </w:rPr>
-              <w:t xml:space="preserve">Tipagem compartilhada com frontend, tipos de API consistentes</w:t>
+              <w:t xml:space="preserve">Tipagem compartilhada com frontend via Pydantic, tipos de API consistentes</w:t>
             </w:r>
           </w:p>
         </w:tc>
@@ -2766,7 +2766,7 @@
                 <w:sz w:val="20"/>
                 <w:szCs w:val="20"/>
               </w:rPr>
-              <w:t xml:space="preserve">Prisma ORM</w:t>
+              <w:t xml:space="preserve">SQLAlchemy 2.0 + Alembic</w:t>
             </w:r>
           </w:p>
         </w:tc>
@@ -2794,7 +2794,7 @@
                 <w:sz w:val="20"/>
                 <w:szCs w:val="20"/>
               </w:rPr>
-              <w:t xml:space="preserve">5.x</w:t>
+              <w:t xml:space="preserve">2.x</w:t>
             </w:r>
           </w:p>
         </w:tc>
@@ -2853,7 +2853,7 @@
                 <w:sz w:val="20"/>
                 <w:szCs w:val="20"/>
               </w:rPr>
-              <w:t xml:space="preserve">Socket.IO</w:t>
+              <w:t xml:space="preserve">FastAPI WebSockets</w:t>
             </w:r>
           </w:p>
         </w:tc>
@@ -2880,7 +2880,7 @@
                 <w:sz w:val="20"/>
                 <w:szCs w:val="20"/>
               </w:rPr>
-              <w:t xml:space="preserve">4.x</w:t>
+              <w:t xml:space="preserve">0.100+</w:t>
             </w:r>
           </w:p>
         </w:tc>
@@ -2907,7 +2907,7 @@
                 <w:sz w:val="20"/>
                 <w:szCs w:val="20"/>
               </w:rPr>
-              <w:t xml:space="preserve">WebSocket com fallback, rooms e namespaces para chat</w:t>
+              <w:t xml:space="preserve">WebSocket nativo com rooms e namespaces para chat</w:t>
             </w:r>
           </w:p>
         </w:tc>
@@ -2939,7 +2939,7 @@
                 <w:sz w:val="20"/>
                 <w:szCs w:val="20"/>
               </w:rPr>
-              <w:t xml:space="preserve">BullMQ</w:t>
+              <w:t xml:space="preserve">Celery</w:t>
             </w:r>
           </w:p>
         </w:tc>
@@ -3026,7 +3026,7 @@
                 <w:sz w:val="20"/>
                 <w:szCs w:val="20"/>
               </w:rPr>
-              <w:t xml:space="preserve">Nodemailer</w:t>
+              <w:t xml:space="preserve">FastAPI-Mail</w:t>
             </w:r>
           </w:p>
         </w:tc>
@@ -3053,7 +3053,7 @@
                 <w:sz w:val="20"/>
                 <w:szCs w:val="20"/>
               </w:rPr>
-              <w:t xml:space="preserve">6.x</w:t>
+              <w:t xml:space="preserve">1.x</w:t>
             </w:r>
           </w:p>
         </w:tc>
@@ -3112,7 +3112,7 @@
                 <w:sz w:val="20"/>
                 <w:szCs w:val="20"/>
               </w:rPr>
-              <w:t xml:space="preserve">JWT (jsonwebtoken)</w:t>
+              <w:t xml:space="preserve">JWT (python-jose)</w:t>
             </w:r>
           </w:p>
         </w:tc>
@@ -3140,7 +3140,7 @@
                 <w:sz w:val="20"/>
                 <w:szCs w:val="20"/>
               </w:rPr>
-              <w:t xml:space="preserve">9.x</w:t>
+              <w:t xml:space="preserve">3.x</w:t>
             </w:r>
           </w:p>
         </w:tc>
@@ -3199,7 +3199,7 @@
                 <w:sz w:val="20"/>
                 <w:szCs w:val="20"/>
               </w:rPr>
-              <w:t xml:space="preserve">Helmet</w:t>
+              <w:t xml:space="preserve">python-slow-digest</w:t>
             </w:r>
           </w:p>
         </w:tc>
@@ -3226,7 +3226,7 @@
                 <w:sz w:val="20"/>
                 <w:szCs w:val="20"/>
               </w:rPr>
-              <w:t xml:space="preserve">7.x</w:t>
+              <w:t xml:space="preserve">1.x</w:t>
             </w:r>
           </w:p>
         </w:tc>
@@ -3285,7 +3285,7 @@
                 <w:sz w:val="20"/>
                 <w:szCs w:val="20"/>
               </w:rPr>
-              <w:t xml:space="preserve">express-rate-limit</w:t>
+              <w:t xml:space="preserve">slowapi</w:t>
             </w:r>
           </w:p>
         </w:tc>
@@ -3313,7 +3313,7 @@
                 <w:sz w:val="20"/>
                 <w:szCs w:val="20"/>
               </w:rPr>
-              <w:t xml:space="preserve">7.x</w:t>
+              <w:t xml:space="preserve">0.1+</w:t>
             </w:r>
           </w:p>
         </w:tc>
@@ -3372,7 +3372,7 @@
                 <w:sz w:val="20"/>
                 <w:szCs w:val="20"/>
               </w:rPr>
-              <w:t xml:space="preserve">Winston</w:t>
+              <w:t xml:space="preserve">Loguru</w:t>
             </w:r>
           </w:p>
         </w:tc>
@@ -3399,7 +3399,7 @@
                 <w:sz w:val="20"/>
                 <w:szCs w:val="20"/>
               </w:rPr>
-              <w:t xml:space="preserve">3.x</w:t>
+              <w:t xml:space="preserve">0.7+</w:t>
             </w:r>
           </w:p>
         </w:tc>
@@ -3458,7 +3458,7 @@
                 <w:sz w:val="20"/>
                 <w:szCs w:val="20"/>
               </w:rPr>
-              <w:t xml:space="preserve">Multer + AWS SDK</w:t>
+              <w:t xml:space="preserve">python-multipart + boto3</w:t>
             </w:r>
           </w:p>
         </w:tc>
@@ -3545,7 +3545,7 @@
                 <w:sz w:val="20"/>
                 <w:szCs w:val="20"/>
               </w:rPr>
-              <w:t xml:space="preserve">Zod</w:t>
+              <w:t xml:space="preserve">Pydantic v2</w:t>
             </w:r>
           </w:p>
         </w:tc>
@@ -3572,7 +3572,7 @@
                 <w:sz w:val="20"/>
                 <w:szCs w:val="20"/>
               </w:rPr>
-              <w:t xml:space="preserve">3.x</w:t>
+              <w:t xml:space="preserve">2.x</w:t>
             </w:r>
           </w:p>
         </w:tc>
@@ -3907,7 +3907,7 @@
                 <w:sz w:val="20"/>
                 <w:szCs w:val="20"/>
               </w:rPr>
-              <w:t xml:space="preserve">Cache em memoria, session store, pub/sub para Socket.IO, filas BullMQ</w:t>
+              <w:t xml:space="preserve">Cache em memoria, session store, pub/sub para WebSocket, filas Celery</w:t>
             </w:r>
           </w:p>
         </w:tc>
@@ -4879,7 +4879,7 @@
                 <w:sz w:val="20"/>
                 <w:szCs w:val="20"/>
               </w:rPr>
-              <w:t xml:space="preserve">API RESTful (Express + TypeScript + Prisma)</w:t>
+              <w:t xml:space="preserve">API RESTful (FastAPI + Python + SQLAlchemy)</w:t>
             </w:r>
           </w:p>
         </w:tc>
@@ -4937,7 +4937,7 @@
                 <w:sz w:val="20"/>
                 <w:szCs w:val="20"/>
               </w:rPr>
-              <w:t xml:space="preserve">Tipos TypeScript, schemas Zod e constantes compartilhados</w:t>
+              <w:t xml:space="preserve">Schemas Pydantic v2 e constantes compartilhados</w:t>
             </w:r>
           </w:p>
         </w:tc>
@@ -5326,7 +5326,7 @@
                 <w:sz w:val="20"/>
                 <w:szCs w:val="20"/>
               </w:rPr>
-              <w:t xml:space="preserve">Codigo fonte principal</w:t>
+              <w:t xml:space="preserve">Codigo fonte React principal</w:t>
             </w:r>
           </w:p>
         </w:tc>
@@ -6010,7 +6010,7 @@
                 <w:sz w:val="20"/>
                 <w:szCs w:val="20"/>
               </w:rPr>
-              <w:t xml:space="preserve">Interfaces e tipos TypeScript</w:t>
+              <w:t xml:space="preserve">Interfaces e tipos TypeScript (frontend)</w:t>
             </w:r>
           </w:p>
         </w:tc>
@@ -6258,7 +6258,7 @@
                 <w:sz w:val="20"/>
                 <w:szCs w:val="20"/>
               </w:rPr>
-              <w:t xml:space="preserve">backend/src/</w:t>
+              <w:t xml:space="preserve">backend/app/</w:t>
             </w:r>
           </w:p>
         </w:tc>
@@ -6285,7 +6285,7 @@
                 <w:sz w:val="20"/>
                 <w:szCs w:val="20"/>
               </w:rPr>
-              <w:t xml:space="preserve">Codigo fonte principal</w:t>
+              <w:t xml:space="preserve">Codigo fonte FastAPI principal</w:t>
             </w:r>
           </w:p>
         </w:tc>
@@ -6486,7 +6486,7 @@
                 <w:sz w:val="20"/>
                 <w:szCs w:val="20"/>
               </w:rPr>
-              <w:t xml:space="preserve">  /repositories/</w:t>
+              <w:t xml:space="preserve">  /models/</w:t>
             </w:r>
           </w:p>
         </w:tc>
@@ -6513,7 +6513,7 @@
                 <w:sz w:val="20"/>
                 <w:szCs w:val="20"/>
               </w:rPr>
-              <w:t xml:space="preserve">Camada de acesso a dados (Prisma queries)</w:t>
+              <w:t xml:space="preserve">Modelos SQLAlchemy para acesso a dados</w:t>
             </w:r>
           </w:p>
         </w:tc>
@@ -6600,7 +6600,7 @@
                 <w:sz w:val="20"/>
                 <w:szCs w:val="20"/>
               </w:rPr>
-              <w:t xml:space="preserve">  /routes/</w:t>
+              <w:t xml:space="preserve">  /routers/</w:t>
             </w:r>
           </w:p>
         </w:tc>
@@ -6627,7 +6627,7 @@
                 <w:sz w:val="20"/>
                 <w:szCs w:val="20"/>
               </w:rPr>
-              <w:t xml:space="preserve">Definicao de rotas Express agrupadas por dominio</w:t>
+              <w:t xml:space="preserve">Definicao de rotas FastAPI agrupadas por dominio</w:t>
             </w:r>
           </w:p>
         </w:tc>
@@ -6657,7 +6657,7 @@
                 <w:sz w:val="20"/>
                 <w:szCs w:val="20"/>
               </w:rPr>
-              <w:t xml:space="preserve">  /validators/</w:t>
+              <w:t xml:space="preserve">  /schemas/</w:t>
             </w:r>
           </w:p>
         </w:tc>
@@ -6685,7 +6685,7 @@
                 <w:sz w:val="20"/>
                 <w:szCs w:val="20"/>
               </w:rPr>
-              <w:t xml:space="preserve">Schemas Zod para validacao de payloads</w:t>
+              <w:t xml:space="preserve">Schemas Pydantic v2 para validacao de payloads</w:t>
             </w:r>
           </w:p>
         </w:tc>
@@ -6714,7 +6714,7 @@
                 <w:sz w:val="20"/>
                 <w:szCs w:val="20"/>
               </w:rPr>
-              <w:t xml:space="preserve">  /jobs/</w:t>
+              <w:t xml:space="preserve">  /tasks/</w:t>
             </w:r>
           </w:p>
         </w:tc>
@@ -6741,7 +6741,7 @@
                 <w:sz w:val="20"/>
                 <w:szCs w:val="20"/>
               </w:rPr>
-              <w:t xml:space="preserve">Workers BullMQ (email, SLA check, cleanup)</w:t>
+              <w:t xml:space="preserve">Tarefas Celery (email, SLA check, cleanup)</w:t>
             </w:r>
           </w:p>
         </w:tc>
@@ -6771,7 +6771,7 @@
                 <w:sz w:val="20"/>
                 <w:szCs w:val="20"/>
               </w:rPr>
-              <w:t xml:space="preserve">  /socket/</w:t>
+              <w:t xml:space="preserve">  /websocket/</w:t>
             </w:r>
           </w:p>
         </w:tc>
@@ -6799,7 +6799,7 @@
                 <w:sz w:val="20"/>
                 <w:szCs w:val="20"/>
               </w:rPr>
-              <w:t xml:space="preserve">Handlers Socket.IO para chat em tempo real</w:t>
+              <w:t xml:space="preserve">Handlers WebSocket para chat em tempo real</w:t>
             </w:r>
           </w:p>
         </w:tc>
@@ -6885,7 +6885,7 @@
                 <w:sz w:val="20"/>
                 <w:szCs w:val="20"/>
               </w:rPr>
-              <w:t xml:space="preserve">  /types/</w:t>
+              <w:t xml:space="preserve">  /migrations/</w:t>
             </w:r>
           </w:p>
         </w:tc>
@@ -6913,7 +6913,7 @@
                 <w:sz w:val="20"/>
                 <w:szCs w:val="20"/>
               </w:rPr>
-              <w:t xml:space="preserve">Tipos TypeScript do backend</w:t>
+              <w:t xml:space="preserve">Migrações Alembic do banco de dados</w:t>
             </w:r>
           </w:p>
         </w:tc>
@@ -6942,7 +6942,7 @@
                 <w:sz w:val="20"/>
                 <w:szCs w:val="20"/>
               </w:rPr>
-              <w:t xml:space="preserve">  /prisma/</w:t>
+              <w:t xml:space="preserve">  main.py</w:t>
             </w:r>
           </w:p>
         </w:tc>
@@ -6969,7 +6969,7 @@
                 <w:sz w:val="20"/>
                 <w:szCs w:val="20"/>
               </w:rPr>
-              <w:t xml:space="preserve">Schema Prisma, migrations e seeds</w:t>
+              <w:t xml:space="preserve">Configuracao da aplicacao FastAPI (middlewares globais)</w:t>
             </w:r>
           </w:p>
         </w:tc>
@@ -6999,7 +6999,7 @@
                 <w:sz w:val="20"/>
                 <w:szCs w:val="20"/>
               </w:rPr>
-              <w:t xml:space="preserve">  app.ts</w:t>
+              <w:t xml:space="preserve">  config.py</w:t>
             </w:r>
           </w:p>
         </w:tc>
@@ -7027,63 +7027,7 @@
                 <w:sz w:val="20"/>
                 <w:szCs w:val="20"/>
               </w:rPr>
-              <w:t xml:space="preserve">Configuracao do Express (middlewares globais)</w:t>
-            </w:r>
-          </w:p>
-        </w:tc>
-      </w:tr>
-      <w:tr>
-        <w:tc>
-          <w:tcPr>
-            <w:tcW w:type="dxa" w:w="4000"/>
-            <w:tcBorders>
-              <w:top w:val="single" w:color="CCCCCC" w:sz="1"/>
-              <w:left w:val="single" w:color="CCCCCC" w:sz="1"/>
-              <w:bottom w:val="single" w:color="CCCCCC" w:sz="1"/>
-              <w:right w:val="single" w:color="CCCCCC" w:sz="1"/>
-            </w:tcBorders>
-            <w:tcMar>
-              <w:top w:type="dxa" w:w="80"/>
-              <w:left w:type="dxa" w:w="120"/>
-              <w:bottom w:type="dxa" w:w="80"/>
-              <w:right w:type="dxa" w:w="120"/>
-            </w:tcMar>
-          </w:tcPr>
-          <w:p>
-            <w:r>
-              <w:rPr>
-                <w:rFonts w:ascii="Arial" w:cs="Arial" w:eastAsia="Arial" w:hAnsi="Arial"/>
-                <w:sz w:val="20"/>
-                <w:szCs w:val="20"/>
-              </w:rPr>
-              <w:t xml:space="preserve">  server.ts</w:t>
-            </w:r>
-          </w:p>
-        </w:tc>
-        <w:tc>
-          <w:tcPr>
-            <w:tcW w:type="dxa" w:w="5360"/>
-            <w:tcBorders>
-              <w:top w:val="single" w:color="CCCCCC" w:sz="1"/>
-              <w:left w:val="single" w:color="CCCCCC" w:sz="1"/>
-              <w:bottom w:val="single" w:color="CCCCCC" w:sz="1"/>
-              <w:right w:val="single" w:color="CCCCCC" w:sz="1"/>
-            </w:tcBorders>
-            <w:tcMar>
-              <w:top w:type="dxa" w:w="80"/>
-              <w:left w:type="dxa" w:w="120"/>
-              <w:bottom w:type="dxa" w:w="80"/>
-              <w:right w:type="dxa" w:w="120"/>
-            </w:tcMar>
-          </w:tcPr>
-          <w:p>
-            <w:r>
-              <w:rPr>
-                <w:rFonts w:ascii="Arial" w:cs="Arial" w:eastAsia="Arial" w:hAnsi="Arial"/>
-                <w:sz w:val="20"/>
-                <w:szCs w:val="20"/>
-              </w:rPr>
-              <w:t xml:space="preserve">Entry point (HTTP + WebSocket server)</w:t>
+              <w:t xml:space="preserve">Configuracoes de ambiente e constantes</w:t>
             </w:r>
           </w:p>
         </w:tc>
@@ -15563,7 +15507,7 @@
           <w:sz w:val="20"/>
           <w:szCs w:val="20"/>
         </w:rPr>
-        <w:t xml:space="preserve">Helmet.js: Headers HTTP de seguranca (CSP, X-Frame-Options, HSTS, X-Content-Type-Options)</w:t>
+        <w:t xml:space="preserve">starlette.middleware.trustedhost: Headers HTTP de seguranca (CSP, X-Frame-Options, HSTS, X-Content-Type-Options)</w:t>
       </w:r>
     </w:p>
     <w:p>
@@ -15617,7 +15561,7 @@
           <w:sz w:val="20"/>
           <w:szCs w:val="20"/>
         </w:rPr>
-        <w:t xml:space="preserve">Sanitizacao: Todas as entradas sanitizadas contra XSS (DOMPurify no frontend, sanitize-html no backend)</w:t>
+        <w:t>Sanitizacao: Todas as entradas sanitizadas contra XSS (DOMPurify no frontend, bleach/nh3 no backend (Python))</w:t>
       </w:r>
     </w:p>
     <w:p>
@@ -15635,7 +15579,7 @@
           <w:sz w:val="20"/>
           <w:szCs w:val="20"/>
         </w:rPr>
-        <w:t xml:space="preserve">SQL Injection: Prisma ORM com queries parametrizadas (sem raw queries expostas)</w:t>
+        <w:t xml:space="preserve">SQL Injection: SQLAlchemy ORM com queries parametrizadas (sem raw queries expostas)</w:t>
       </w:r>
     </w:p>
     <w:p>
@@ -15671,7 +15615,7 @@
           <w:sz w:val="20"/>
           <w:szCs w:val="20"/>
         </w:rPr>
-        <w:t xml:space="preserve">Senhas: bcrypt com salt rounds = 12, requisitos minimos de complexidade</w:t>
+        <w:t xml:space="preserve">Senhas: passlib[bcrypt] com salt rounds = 12, requisitos minimos de complexidade</w:t>
       </w:r>
     </w:p>
     <w:p>
@@ -15884,7 +15828,7 @@
           <w:sz w:val="24"/>
           <w:szCs w:val="24"/>
         </w:rPr>
-        <w:t xml:space="preserve">7.1 Arquitetura Socket.IO</w:t>
+        <w:t xml:space="preserve">7.1 Arquitetura WebSocket</w:t>
       </w:r>
     </w:p>
     <w:p>
@@ -15897,7 +15841,7 @@
           <w:sz w:val="20"/>
           <w:szCs w:val="20"/>
         </w:rPr>
-        <w:t xml:space="preserve">O Socket.IO e utilizado para comunicacao bidirecional em tempo real, com Redis Adapter para suporte a multiplas instancias do servidor:</w:t>
+        <w:t xml:space="preserve">O FastAPI WebSocket e utilizado para comunicacao bidirecional em tempo real, com Redis Pub/Sub para suporte a multiplas instancias do servidor:</w:t>
       </w:r>
     </w:p>
     <w:p>
@@ -16299,7 +16243,7 @@
           <w:sz w:val="24"/>
           <w:szCs w:val="24"/>
         </w:rPr>
-        <w:t xml:space="preserve">7.2 Eventos Socket.IO</w:t>
+        <w:t xml:space="preserve">7.2 Eventos WebSocket</w:t>
       </w:r>
     </w:p>
     <w:tbl>
@@ -17139,7 +17083,7 @@
           <w:sz w:val="20"/>
           <w:szCs w:val="20"/>
         </w:rPr>
-        <w:t xml:space="preserve">A conexao Socket.IO requer autenticacao via JWT enviado no handshake. O middleware de autenticacao valida o token antes de permitir a conexao:</w:t>
+        <w:t xml:space="preserve">A conexao WebSocket requer autenticacao via JWT enviado na query string. O middleware de autenticacao valida o token antes de permitir a conexao:</w:t>
       </w:r>
     </w:p>
     <w:p>
@@ -18281,7 +18225,7 @@
           <w:sz w:val="24"/>
           <w:szCs w:val="24"/>
         </w:rPr>
-        <w:t xml:space="preserve">9.1 Arquitetura BullMQ</w:t>
+        <w:t xml:space="preserve">9.1 Arquitetura Celery</w:t>
       </w:r>
     </w:p>
     <w:p>
@@ -18294,7 +18238,7 @@
           <w:sz w:val="20"/>
           <w:szCs w:val="20"/>
         </w:rPr>
-        <w:t xml:space="preserve">O BullMQ utiliza Redis para gerenciar filas de processamento assincrono, separando operacoes pesadas ou demoradas do fluxo principal de requisicoes HTTP:</w:t>
+        <w:t xml:space="preserve">O Celery utiliza Redis para gerenciar filas de processamento assincrono, separando operacoes pesadas ou demoradas do fluxo principal de requisicoes HTTP:</w:t>
       </w:r>
     </w:p>
     <w:p>
@@ -19643,7 +19587,7 @@
           <w:sz w:val="20"/>
           <w:szCs w:val="20"/>
         </w:rPr>
-        <w:t xml:space="preserve">O sistema utiliza Nodemailer com SMTP corporativo para todas as comunicacoes por e-mail:</w:t>
+        <w:t xml:space="preserve">O sistema utiliza FastAPI-Mail com SMTP corporativo para todas as comunicacoes por e-mail:</w:t>
       </w:r>
     </w:p>
     <w:p>
@@ -20723,7 +20667,7 @@
           <w:sz w:val="20"/>
           <w:szCs w:val="20"/>
         </w:rPr>
-        <w:t xml:space="preserve">Biblioteca: Winston com transports para console (dev) e arquivo rotativo (prod)</w:t>
+        <w:t xml:space="preserve">Biblioteca: Loguru com rotacao de arquivo automatica para console (dev) e arquivo rotativo (prod)</w:t>
       </w:r>
     </w:p>
     <w:p>
@@ -20920,7 +20864,7 @@
           <w:sz w:val="20"/>
           <w:szCs w:val="20"/>
         </w:rPr>
-        <w:t xml:space="preserve">Filas BullMQ: jobs pendentes, ativos e falhados por fila</w:t>
+        <w:t xml:space="preserve">Filas Celery: tarefas pendentes, ativas e falhadas por fila</w:t>
       </w:r>
     </w:p>
     <w:p>
@@ -21014,7 +20958,7 @@
           <w:sz w:val="20"/>
           <w:szCs w:val="20"/>
         </w:rPr>
-        <w:t xml:space="preserve">Uso de memoria e CPU do Node.js</w:t>
+        <w:t xml:space="preserve">Uso de memoria e CPU do Python</w:t>
       </w:r>
     </w:p>
     <w:p>
@@ -21032,7 +20976,7 @@
           <w:sz w:val="20"/>
           <w:szCs w:val="20"/>
         </w:rPr>
-        <w:t xml:space="preserve">Tamanho das filas BullMQ e taxa de processamento</w:t>
+        <w:t xml:space="preserve">Tamanho das filas Celery e taxa de processamento</w:t>
       </w:r>
     </w:p>
     <w:p>
@@ -21438,7 +21382,7 @@
                 <w:sz w:val="20"/>
                 <w:szCs w:val="20"/>
               </w:rPr>
-              <w:t xml:space="preserve">node:20-alpine</w:t>
+              <w:t xml:space="preserve">python:3.12-slim</w:t>
             </w:r>
           </w:p>
         </w:tc>
@@ -21465,7 +21409,7 @@
                 <w:sz w:val="20"/>
                 <w:szCs w:val="20"/>
               </w:rPr>
-              <w:t xml:space="preserve">API Express + Socket.IO server</w:t>
+              <w:t xml:space="preserve">API FastAPI + WebSocket server</w:t>
             </w:r>
           </w:p>
         </w:tc>
@@ -21892,7 +21836,7 @@
                 <w:sz w:val="20"/>
                 <w:szCs w:val="20"/>
               </w:rPr>
-              <w:t xml:space="preserve">NODE_ENV</w:t>
+              <w:t xml:space="preserve">APP_ENV</w:t>
             </w:r>
           </w:p>
         </w:tc>
@@ -23395,7 +23339,7 @@
                 <w:sz w:val="20"/>
                 <w:szCs w:val="20"/>
               </w:rPr>
-              <w:t xml:space="preserve">ESLint + TypeScript compiler no frontend e backend</w:t>
+              <w:t xml:space="preserve">ESLint no frontend, Ruff + Black no backend</w:t>
             </w:r>
           </w:p>
         </w:tc>
@@ -23483,7 +23427,7 @@
                 <w:sz w:val="20"/>
                 <w:szCs w:val="20"/>
               </w:rPr>
-              <w:t xml:space="preserve">Jest/Vitest com cobertura minima de 80%</w:t>
+              <w:t xml:space="preserve">Vitest (frontend), pytest (backend) com cobertura minima de 80%</w:t>
             </w:r>
           </w:p>
         </w:tc>

</xml_diff>